<commit_message>
add auto-save session for users
</commit_message>
<xml_diff>
--- a/samples/NDA-2024.docx
+++ b/samples/NDA-2024.docx
@@ -33,6 +33,9 @@
     </w:p>
     <w:p>
       <w:r>
+        <w:rPr>
+          <w:highlight w:val="green"/>
+        </w:rPr>
         <w:t>Confidential Information means any non-public business, technical, or financial information disclosed by one party to the other party.</w:t>
       </w:r>
     </w:p>
@@ -72,13 +75,7 @@
     </w:p>
     <w:p>
       <w:r>
-        <w:rPr>
-          <w:highlight w:val="green"/>
-        </w:rPr>
-        <w:t>As provided in Section 4, the duty to protect Confidential Information continues for five years following the date of disclosure</w:t>
-      </w:r>
-      <w:r>
-        <w:t>.</w:t>
+        <w:t>As provided in Section 4, the duty to protect Confidential Information continues for five years following the date of disclosure.</w:t>
       </w:r>
     </w:p>
     <w:p>
@@ -91,7 +88,13 @@
     </w:p>
     <w:p>
       <w:r>
-        <w:t>The definition of Confidential Information also includes the categories set forth in the Master Services Agreement dated 1 January 2023.</w:t>
+        <w:t>The definition of Confidential Information also includes the categories set forth in the Master Services Agreement dated 1 January 202</w:t>
+      </w:r>
+      <w:r>
+        <w:t>2</w:t>
+      </w:r>
+      <w:r>
+        <w:t>.</w:t>
       </w:r>
     </w:p>
     <w:p>
@@ -12061,7 +12064,9 @@
 <we:webextension xmlns:we="http://schemas.microsoft.com/office/webextensions/webextension/2010/11" id="{089F3C44-F9D6-7043-9659-7E44EF59E4C1}">
   <we:reference id="a4f3e2c1-b567-4d89-a012-f3e4d5c6b7a8" version="1.0.0.0" store="developer" storeType="Registry"/>
   <we:alternateReferences/>
-  <we:properties/>
+  <we:properties>
+    <we:property name="lcg_workspace_id" value="&quot;ws-1781564581536-122e1f66&quot;"/>
+  </we:properties>
   <we:bindings/>
   <we:snapshot xmlns:r="http://schemas.openxmlformats.org/officeDocument/2006/relationships"/>
 </we:webextension>

</xml_diff>

<commit_message>
remove redundant files and add better configuration for review power
</commit_message>
<xml_diff>
--- a/samples/NDA-2024.docx
+++ b/samples/NDA-2024.docx
@@ -1,6 +1,6 @@
 
 <file path=word/document.xml><?xml version="1.0" encoding="utf-8"?>
-<w:document xmlns:wpc="http://schemas.microsoft.com/office/word/2010/wordprocessingCanvas" xmlns:cx="http://schemas.microsoft.com/office/drawing/2014/chartex" xmlns:cx1="http://schemas.microsoft.com/office/drawing/2015/9/8/chartex" xmlns:cx2="http://schemas.microsoft.com/office/drawing/2015/10/21/chartex" xmlns:cx3="http://schemas.microsoft.com/office/drawing/2016/5/9/chartex" xmlns:cx4="http://schemas.microsoft.com/office/drawing/2016/5/10/chartex" xmlns:cx5="http://schemas.microsoft.com/office/drawing/2016/5/11/chartex" xmlns:cx6="http://schemas.microsoft.com/office/drawing/2016/5/12/chartex" xmlns:cx7="http://schemas.microsoft.com/office/drawing/2016/5/13/chartex" xmlns:cx8="http://schemas.microsoft.com/office/drawing/2016/5/14/chartex" xmlns:mc="http://schemas.openxmlformats.org/markup-compatibility/2006" xmlns:aink="http://schemas.microsoft.com/office/drawing/2016/ink" xmlns:am3d="http://schemas.microsoft.com/office/drawing/2017/model3d" xmlns:o="urn:schemas-microsoft-com:office:office" xmlns:oel="http://schemas.microsoft.com/office/2019/extlst" xmlns:r="http://schemas.openxmlformats.org/officeDocument/2006/relationships" xmlns:m="http://schemas.openxmlformats.org/officeDocument/2006/math" xmlns:v="urn:schemas-microsoft-com:vml" xmlns:wp14="http://schemas.microsoft.com/office/word/2010/wordprocessingDrawing" xmlns:wp="http://schemas.openxmlformats.org/drawingml/2006/wordprocessingDrawing" xmlns:w10="urn:schemas-microsoft-com:office:word" xmlns:w="http://schemas.openxmlformats.org/wordprocessingml/2006/main" xmlns:w14="http://schemas.microsoft.com/office/word/2010/wordml" xmlns:w15="http://schemas.microsoft.com/office/word/2012/wordml" xmlns:w16cex="http://schemas.microsoft.com/office/word/2018/wordml/cex" xmlns:w16cid="http://schemas.microsoft.com/office/word/2016/wordml/cid" xmlns:w16="http://schemas.microsoft.com/office/word/2018/wordml" xmlns:w16du="http://schemas.microsoft.com/office/word/2023/wordml/word16du" xmlns:w16sdtdh="http://schemas.microsoft.com/office/word/2020/wordml/sdtdatahash" xmlns:w16sdtfl="http://schemas.microsoft.com/office/word/2024/wordml/sdtformatlock" xmlns:w16se="http://schemas.microsoft.com/office/word/2015/wordml/symex" xmlns:wpg="http://schemas.microsoft.com/office/word/2010/wordprocessingGroup" xmlns:wpi="http://schemas.microsoft.com/office/word/2010/wordprocessingInk" xmlns:wne="http://schemas.microsoft.com/office/word/2006/wordml" xmlns:wps="http://schemas.microsoft.com/office/word/2010/wordprocessingShape" mc:Ignorable="w14 w15 w16se w16cid w16 w16cex w16sdtdh w16sdtfl w16du wp14">
+<w:document xmlns:wpc="http://schemas.microsoft.com/office/word/2010/wordprocessingCanvas" xmlns:cx="http://schemas.microsoft.com/office/drawing/2014/chartex" xmlns:cx1="http://schemas.microsoft.com/office/drawing/2015/9/8/chartex" xmlns:cx2="http://schemas.microsoft.com/office/drawing/2015/10/21/chartex" xmlns:cx3="http://schemas.microsoft.com/office/drawing/2016/5/9/chartex" xmlns:cx4="http://schemas.microsoft.com/office/drawing/2016/5/10/chartex" xmlns:cx5="http://schemas.microsoft.com/office/drawing/2016/5/11/chartex" xmlns:cx6="http://schemas.microsoft.com/office/drawing/2016/5/12/chartex" xmlns:cx7="http://schemas.microsoft.com/office/drawing/2016/5/13/chartex" xmlns:cx8="http://schemas.microsoft.com/office/drawing/2016/5/14/chartex" xmlns:mc="http://schemas.openxmlformats.org/markup-compatibility/2006" xmlns:m="http://schemas.openxmlformats.org/officeDocument/2006/math" xmlns:aink="http://schemas.microsoft.com/office/drawing/2016/ink" xmlns:am3d="http://schemas.microsoft.com/office/drawing/2017/model3d" xmlns:oel="http://schemas.microsoft.com/office/2019/extlst" xmlns:r="http://schemas.openxmlformats.org/officeDocument/2006/relationships" xmlns:wp14="http://schemas.microsoft.com/office/word/2010/wordprocessingDrawing" xmlns:wp="http://schemas.openxmlformats.org/drawingml/2006/wordprocessingDrawing" xmlns:wpg="http://schemas.microsoft.com/office/word/2010/wordprocessingGroup" xmlns:wpi="http://schemas.microsoft.com/office/word/2010/wordprocessingInk" xmlns:wps="http://schemas.microsoft.com/office/word/2010/wordprocessingShape" xmlns:o="urn:schemas-microsoft-com:office:office" xmlns:v="urn:schemas-microsoft-com:vml" xmlns:w10="urn:schemas-microsoft-com:office:word" xmlns:w="http://schemas.openxmlformats.org/wordprocessingml/2006/main" xmlns:w14="http://schemas.microsoft.com/office/word/2010/wordml" xmlns:w15="http://schemas.microsoft.com/office/word/2012/wordml" xmlns:w16cex="http://schemas.microsoft.com/office/word/2018/wordml/cex" xmlns:w16cid="http://schemas.microsoft.com/office/word/2016/wordml/cid" xmlns:w16="http://schemas.microsoft.com/office/word/2018/wordml" xmlns:w16sdtdh="http://schemas.microsoft.com/office/word/2020/wordml/sdtdatahash" xmlns:w16sdtfl="http://schemas.microsoft.com/office/word/2024/wordml/sdtformatlock" xmlns:w16se="http://schemas.microsoft.com/office/word/2015/wordml/symex" xmlns:w16du="http://schemas.microsoft.com/office/word/2023/wordml/word16du" xmlns:wne="http://schemas.microsoft.com/office/word/2006/wordml" mc:Ignorable="w14 w15 w16se w16cid w16 w16cex w16sdtdh w16sdtfl w16du wp14">
   <w:body>
     <w:p>
       <w:pPr>
@@ -33,9 +33,6 @@
     </w:p>
     <w:p>
       <w:r>
-        <w:rPr>
-          <w:highlight w:val="green"/>
-        </w:rPr>
         <w:t>Confidential Information means any non-public business, technical, or financial information disclosed by one party to the other party.</w:t>
       </w:r>
     </w:p>
@@ -49,7 +46,13 @@
     </w:p>
     <w:p>
       <w:r>
-        <w:t>The Receiving Party shall keep all Confidential Information strictly secret and shall not disclose it to any third party without prior written consent.</w:t>
+        <w:rPr>
+          <w:highlight w:val="green"/>
+        </w:rPr>
+        <w:t>The Receiving Party shall keep all Confidential Information strictly secret and shall not disclose it to any third party without prior written consent</w:t>
+      </w:r>
+      <w:r>
+        <w:t>. Pursuant to the Data Processing Addendum, the Receiving Party shall not disclose Confidential Information to any third party without the prior written consent of the Disclosing Party.</w:t>
       </w:r>
     </w:p>
     <w:p>
@@ -88,13 +91,25 @@
     </w:p>
     <w:p>
       <w:r>
+        <w:rPr>
+          <w:highlight w:val="lightGray"/>
+        </w:rPr>
         <w:t>The definition of Confidential Information also includes the categories set forth in the Master Services Agreement dated 1 January 202</w:t>
       </w:r>
       <w:r>
-        <w:t>2</w:t>
+        <w:rPr>
+          <w:highlight w:val="lightGray"/>
+        </w:rPr>
+        <w:t>4</w:t>
       </w:r>
       <w:r>
-        <w:t>.</w:t>
+        <w:t xml:space="preserve">. </w:t>
+      </w:r>
+      <w:r>
+        <w:rPr>
+          <w:highlight w:val="magenta"/>
+        </w:rPr>
+        <w:t>As set forth in the Master Services Agreement, all intellectual property created under this Agreement becomes the property of the Receiving Party.</w:t>
       </w:r>
     </w:p>
     <w:p>
@@ -120,7 +135,7 @@
     </w:p>
     <w:p>
       <w:r>
-        <w:t>Each party shall indemnify the other party for any losses arising from a material breach of this Agreement.</w:t>
+        <w:t>Each party shall indemnify the other party for any losses arising from a material breach of this Agreement. As provided in the Master Services Agreement, each party shall maintain cyber-liability insurance of at least five million dollars ($5,000,000).</w:t>
       </w:r>
     </w:p>
     <w:p>
@@ -128,12 +143,50 @@
         <w:pStyle w:val="Heading2"/>
       </w:pPr>
       <w:r>
+        <w:lastRenderedPageBreak/>
         <w:t>Section 9. Governing Law</w:t>
       </w:r>
     </w:p>
     <w:p>
       <w:r>
+        <w:rPr>
+          <w:highlight w:val="lightGray"/>
+        </w:rPr>
         <w:t>This Agreement shall be governed by and construed in accordance with the laws of the State of Delaware.</w:t>
+      </w:r>
+    </w:p>
+    <w:p>
+      <w:pPr>
+        <w:pStyle w:val="Heading2"/>
+      </w:pPr>
+      <w:r>
+        <w:t>Section 10. Data Protection Representations.</w:t>
+      </w:r>
+    </w:p>
+    <w:p>
+      <w:r>
+        <w:t xml:space="preserve">Pursuant to the Data Processing Addendum, </w:t>
+      </w:r>
+      <w:r>
+        <w:t>the Receiving Party shall notify the Disclosing Party of any personal data breach within seventy-</w:t>
+      </w:r>
+      <w:r>
+        <w:t xml:space="preserve">three (73) </w:t>
+      </w:r>
+      <w:r>
+        <w:t>hours of discovery</w:t>
+      </w:r>
+      <w:r>
+        <w:t>. As set forth in the Data Processing Addendum</w:t>
+      </w:r>
+      <w:r>
+        <w:rPr>
+          <w:highlight w:val="magenta"/>
+        </w:rPr>
+        <w:t>, the Receiving Party may disclose Confidential Information to any third party without the prior written consent of the Disclosing Party</w:t>
+      </w:r>
+      <w:r>
+        <w:t>. As provided in the Data Processing Addendum, the Provider guarantees 99.9% monthly service uptime availability.</w:t>
       </w:r>
     </w:p>
     <w:sectPr>
@@ -147,7 +200,7 @@
 </file>
 
 <file path=word/numbering.xml><?xml version="1.0" encoding="utf-8"?>
-<w:numbering xmlns:wpc="http://schemas.microsoft.com/office/word/2010/wordprocessingCanvas" xmlns:cx="http://schemas.microsoft.com/office/drawing/2014/chartex" xmlns:cx1="http://schemas.microsoft.com/office/drawing/2015/9/8/chartex" xmlns:cx2="http://schemas.microsoft.com/office/drawing/2015/10/21/chartex" xmlns:cx3="http://schemas.microsoft.com/office/drawing/2016/5/9/chartex" xmlns:cx4="http://schemas.microsoft.com/office/drawing/2016/5/10/chartex" xmlns:cx5="http://schemas.microsoft.com/office/drawing/2016/5/11/chartex" xmlns:cx6="http://schemas.microsoft.com/office/drawing/2016/5/12/chartex" xmlns:cx7="http://schemas.microsoft.com/office/drawing/2016/5/13/chartex" xmlns:cx8="http://schemas.microsoft.com/office/drawing/2016/5/14/chartex" xmlns:mc="http://schemas.openxmlformats.org/markup-compatibility/2006" xmlns:aink="http://schemas.microsoft.com/office/drawing/2016/ink" xmlns:am3d="http://schemas.microsoft.com/office/drawing/2017/model3d" xmlns:o="urn:schemas-microsoft-com:office:office" xmlns:oel="http://schemas.microsoft.com/office/2019/extlst" xmlns:r="http://schemas.openxmlformats.org/officeDocument/2006/relationships" xmlns:m="http://schemas.openxmlformats.org/officeDocument/2006/math" xmlns:v="urn:schemas-microsoft-com:vml" xmlns:wp14="http://schemas.microsoft.com/office/word/2010/wordprocessingDrawing" xmlns:wp="http://schemas.openxmlformats.org/drawingml/2006/wordprocessingDrawing" xmlns:w10="urn:schemas-microsoft-com:office:word" xmlns:w="http://schemas.openxmlformats.org/wordprocessingml/2006/main" xmlns:w14="http://schemas.microsoft.com/office/word/2010/wordml" xmlns:w15="http://schemas.microsoft.com/office/word/2012/wordml" xmlns:w16cex="http://schemas.microsoft.com/office/word/2018/wordml/cex" xmlns:w16cid="http://schemas.microsoft.com/office/word/2016/wordml/cid" xmlns:w16="http://schemas.microsoft.com/office/word/2018/wordml" xmlns:w16du="http://schemas.microsoft.com/office/word/2023/wordml/word16du" xmlns:w16sdtdh="http://schemas.microsoft.com/office/word/2020/wordml/sdtdatahash" xmlns:w16sdtfl="http://schemas.microsoft.com/office/word/2024/wordml/sdtformatlock" xmlns:w16se="http://schemas.microsoft.com/office/word/2015/wordml/symex" xmlns:wpg="http://schemas.microsoft.com/office/word/2010/wordprocessingGroup" xmlns:wpi="http://schemas.microsoft.com/office/word/2010/wordprocessingInk" xmlns:wne="http://schemas.microsoft.com/office/word/2006/wordml" xmlns:wps="http://schemas.microsoft.com/office/word/2010/wordprocessingShape" mc:Ignorable="w14 w15 w16se w16cid w16 w16cex w16sdtdh w16sdtfl w16du wp14">
+<w:numbering xmlns:wpc="http://schemas.microsoft.com/office/word/2010/wordprocessingCanvas" xmlns:cx="http://schemas.microsoft.com/office/drawing/2014/chartex" xmlns:cx1="http://schemas.microsoft.com/office/drawing/2015/9/8/chartex" xmlns:cx2="http://schemas.microsoft.com/office/drawing/2015/10/21/chartex" xmlns:cx3="http://schemas.microsoft.com/office/drawing/2016/5/9/chartex" xmlns:cx4="http://schemas.microsoft.com/office/drawing/2016/5/10/chartex" xmlns:cx5="http://schemas.microsoft.com/office/drawing/2016/5/11/chartex" xmlns:cx6="http://schemas.microsoft.com/office/drawing/2016/5/12/chartex" xmlns:cx7="http://schemas.microsoft.com/office/drawing/2016/5/13/chartex" xmlns:cx8="http://schemas.microsoft.com/office/drawing/2016/5/14/chartex" xmlns:mc="http://schemas.openxmlformats.org/markup-compatibility/2006" xmlns:m="http://schemas.openxmlformats.org/officeDocument/2006/math" xmlns:aink="http://schemas.microsoft.com/office/drawing/2016/ink" xmlns:am3d="http://schemas.microsoft.com/office/drawing/2017/model3d" xmlns:oel="http://schemas.microsoft.com/office/2019/extlst" xmlns:r="http://schemas.openxmlformats.org/officeDocument/2006/relationships" xmlns:wp14="http://schemas.microsoft.com/office/word/2010/wordprocessingDrawing" xmlns:wp="http://schemas.openxmlformats.org/drawingml/2006/wordprocessingDrawing" xmlns:wpg="http://schemas.microsoft.com/office/word/2010/wordprocessingGroup" xmlns:wpi="http://schemas.microsoft.com/office/word/2010/wordprocessingInk" xmlns:wps="http://schemas.microsoft.com/office/word/2010/wordprocessingShape" xmlns:o="urn:schemas-microsoft-com:office:office" xmlns:v="urn:schemas-microsoft-com:vml" xmlns:w10="urn:schemas-microsoft-com:office:word" xmlns:w="http://schemas.openxmlformats.org/wordprocessingml/2006/main" xmlns:w14="http://schemas.microsoft.com/office/word/2010/wordml" xmlns:w15="http://schemas.microsoft.com/office/word/2012/wordml" xmlns:w16cex="http://schemas.microsoft.com/office/word/2018/wordml/cex" xmlns:w16cid="http://schemas.microsoft.com/office/word/2016/wordml/cid" xmlns:w16="http://schemas.microsoft.com/office/word/2018/wordml" xmlns:w16sdtdh="http://schemas.microsoft.com/office/word/2020/wordml/sdtdatahash" xmlns:w16sdtfl="http://schemas.microsoft.com/office/word/2024/wordml/sdtformatlock" xmlns:w16se="http://schemas.microsoft.com/office/word/2015/wordml/symex" xmlns:w16du="http://schemas.microsoft.com/office/word/2023/wordml/word16du" xmlns:wne="http://schemas.microsoft.com/office/word/2006/wordml" mc:Ignorable="w14 w15 w16se w16cid w16 w16cex w16sdtdh w16sdtfl w16du wp14">
   <w:abstractNum w:abstractNumId="0" w15:restartNumberingAfterBreak="0">
     <w:nsid w:val="FFFFFF7C"/>
     <w:multiLevelType w:val="singleLevel"/>
@@ -319,38 +372,38 @@
       </w:rPr>
     </w:lvl>
   </w:abstractNum>
-  <w:num w:numId="1" w16cid:durableId="277223231">
+  <w:num w:numId="1" w16cid:durableId="494686313">
     <w:abstractNumId w:val="8"/>
   </w:num>
-  <w:num w:numId="2" w16cid:durableId="690836187">
+  <w:num w:numId="2" w16cid:durableId="135536242">
     <w:abstractNumId w:val="6"/>
   </w:num>
-  <w:num w:numId="3" w16cid:durableId="811680340">
+  <w:num w:numId="3" w16cid:durableId="1552614112">
     <w:abstractNumId w:val="5"/>
   </w:num>
-  <w:num w:numId="4" w16cid:durableId="1348213515">
+  <w:num w:numId="4" w16cid:durableId="63652728">
     <w:abstractNumId w:val="4"/>
   </w:num>
-  <w:num w:numId="5" w16cid:durableId="764958103">
+  <w:num w:numId="5" w16cid:durableId="1520467718">
     <w:abstractNumId w:val="7"/>
   </w:num>
-  <w:num w:numId="6" w16cid:durableId="454327693">
+  <w:num w:numId="6" w16cid:durableId="604074363">
     <w:abstractNumId w:val="3"/>
   </w:num>
-  <w:num w:numId="7" w16cid:durableId="1702317316">
+  <w:num w:numId="7" w16cid:durableId="489949536">
     <w:abstractNumId w:val="2"/>
   </w:num>
-  <w:num w:numId="8" w16cid:durableId="497499100">
+  <w:num w:numId="8" w16cid:durableId="515732143">
     <w:abstractNumId w:val="1"/>
   </w:num>
-  <w:num w:numId="9" w16cid:durableId="453256561">
+  <w:num w:numId="9" w16cid:durableId="999776040">
     <w:abstractNumId w:val="0"/>
   </w:num>
 </w:numbering>
 </file>
 
 <file path=word/styles.xml><?xml version="1.0" encoding="utf-8"?>
-<w:styles xmlns:mc="http://schemas.openxmlformats.org/markup-compatibility/2006" xmlns:r="http://schemas.openxmlformats.org/officeDocument/2006/relationships" xmlns:w="http://schemas.openxmlformats.org/wordprocessingml/2006/main" xmlns:w14="http://schemas.microsoft.com/office/word/2010/wordml" xmlns:w15="http://schemas.microsoft.com/office/word/2012/wordml" xmlns:w16cex="http://schemas.microsoft.com/office/word/2018/wordml/cex" xmlns:w16cid="http://schemas.microsoft.com/office/word/2016/wordml/cid" xmlns:w16="http://schemas.microsoft.com/office/word/2018/wordml" xmlns:w16du="http://schemas.microsoft.com/office/word/2023/wordml/word16du" xmlns:w16sdtdh="http://schemas.microsoft.com/office/word/2020/wordml/sdtdatahash" xmlns:w16sdtfl="http://schemas.microsoft.com/office/word/2024/wordml/sdtformatlock" xmlns:w16se="http://schemas.microsoft.com/office/word/2015/wordml/symex" mc:Ignorable="w14 w15 w16se w16cid w16 w16cex w16sdtdh w16sdtfl w16du">
+<w:styles xmlns:mc="http://schemas.openxmlformats.org/markup-compatibility/2006" xmlns:r="http://schemas.openxmlformats.org/officeDocument/2006/relationships" xmlns:w="http://schemas.openxmlformats.org/wordprocessingml/2006/main" xmlns:w14="http://schemas.microsoft.com/office/word/2010/wordml" xmlns:w15="http://schemas.microsoft.com/office/word/2012/wordml" xmlns:w16cex="http://schemas.microsoft.com/office/word/2018/wordml/cex" xmlns:w16cid="http://schemas.microsoft.com/office/word/2016/wordml/cid" xmlns:w16="http://schemas.microsoft.com/office/word/2018/wordml" xmlns:w16sdtdh="http://schemas.microsoft.com/office/word/2020/wordml/sdtdatahash" xmlns:w16sdtfl="http://schemas.microsoft.com/office/word/2024/wordml/sdtformatlock" xmlns:w16se="http://schemas.microsoft.com/office/word/2015/wordml/symex" xmlns:w16du="http://schemas.microsoft.com/office/word/2023/wordml/word16du" mc:Ignorable="w14 w15 w16se w16cid w16 w16cex w16sdtdh w16sdtfl w16du">
   <w:docDefaults>
     <w:rPrDefault>
       <w:rPr>
@@ -12061,11 +12114,11 @@
 </file>
 
 <file path=word/webextensions/webextension1.xml><?xml version="1.0" encoding="utf-8"?>
-<we:webextension xmlns:we="http://schemas.microsoft.com/office/webextensions/webextension/2010/11" id="{089F3C44-F9D6-7043-9659-7E44EF59E4C1}">
+<we:webextension xmlns:we="http://schemas.microsoft.com/office/webextensions/webextension/2010/11" id="{4AD99CA3-5C0E-6A4A-A552-E732E32BBABD}">
   <we:reference id="a4f3e2c1-b567-4d89-a012-f3e4d5c6b7a8" version="1.0.0.0" store="developer" storeType="Registry"/>
   <we:alternateReferences/>
   <we:properties>
-    <we:property name="lcg_workspace_id" value="&quot;ws-1781564581536-122e1f66&quot;"/>
+    <we:property name="lcg_workspace_id" value="&quot;ws-1781826083987-v4ztm5kr&quot;"/>
   </we:properties>
   <we:bindings/>
   <we:snapshot xmlns:r="http://schemas.openxmlformats.org/officeDocument/2006/relationships"/>

</xml_diff>